<commit_message>
Update EE404 Lab 8 Instructions.docx
</commit_message>
<xml_diff>
--- a/Lab 8/EE404 Lab 8 Instructions.docx
+++ b/Lab 8/EE404 Lab 8 Instructions.docx
@@ -1,6 +1,6 @@
 
 <file path=word/document.xml><?xml version="1.0" encoding="utf-8"?>
-<w:document xmlns:wpc="http://schemas.microsoft.com/office/word/2010/wordprocessingCanvas" xmlns:cx="http://schemas.microsoft.com/office/drawing/2014/chartex" xmlns:cx1="http://schemas.microsoft.com/office/drawing/2015/9/8/chartex" xmlns:cx2="http://schemas.microsoft.com/office/drawing/2015/10/21/chartex" xmlns:cx3="http://schemas.microsoft.com/office/drawing/2016/5/9/chartex" xmlns:cx4="http://schemas.microsoft.com/office/drawing/2016/5/10/chartex" xmlns:cx5="http://schemas.microsoft.com/office/drawing/2016/5/11/chartex" xmlns:cx6="http://schemas.microsoft.com/office/drawing/2016/5/12/chartex" xmlns:cx7="http://schemas.microsoft.com/office/drawing/2016/5/13/chartex" xmlns:cx8="http://schemas.microsoft.com/office/drawing/2016/5/14/chartex" xmlns:mc="http://schemas.openxmlformats.org/markup-compatibility/2006" xmlns:aink="http://schemas.microsoft.com/office/drawing/2016/ink" xmlns:am3d="http://schemas.microsoft.com/office/drawing/2017/model3d" xmlns:o="urn:schemas-microsoft-com:office:office" xmlns:oel="http://schemas.microsoft.com/office/2019/extlst" xmlns:r="http://schemas.openxmlformats.org/officeDocument/2006/relationships" xmlns:m="http://schemas.openxmlformats.org/officeDocument/2006/math" xmlns:v="urn:schemas-microsoft-com:vml" xmlns:wp14="http://schemas.microsoft.com/office/word/2010/wordprocessingDrawing" xmlns:wp="http://schemas.openxmlformats.org/drawingml/2006/wordprocessingDrawing" xmlns:w10="urn:schemas-microsoft-com:office:word" xmlns:w="http://schemas.openxmlformats.org/wordprocessingml/2006/main" xmlns:w14="http://schemas.microsoft.com/office/word/2010/wordml" xmlns:w15="http://schemas.microsoft.com/office/word/2012/wordml" xmlns:w16cex="http://schemas.microsoft.com/office/word/2018/wordml/cex" xmlns:w16cid="http://schemas.microsoft.com/office/word/2016/wordml/cid" xmlns:w16="http://schemas.microsoft.com/office/word/2018/wordml" xmlns:w16du="http://schemas.microsoft.com/office/word/2023/wordml/word16du" xmlns:w16sdtdh="http://schemas.microsoft.com/office/word/2020/wordml/sdtdatahash" xmlns:w16sdtfl="http://schemas.microsoft.com/office/word/2024/wordml/sdtformatlock" xmlns:w16se="http://schemas.microsoft.com/office/word/2015/wordml/symex" xmlns:wpg="http://schemas.microsoft.com/office/word/2010/wordprocessingGroup" xmlns:wpi="http://schemas.microsoft.com/office/word/2010/wordprocessingInk" xmlns:wne="http://schemas.microsoft.com/office/word/2006/wordml" xmlns:wps="http://schemas.microsoft.com/office/word/2010/wordprocessingShape" mc:Ignorable="w14 w15 w16se w16cid w16 w16cex w16sdtdh w16sdtfl w16du wp14">
+<w:document xmlns:wpc="http://schemas.microsoft.com/office/word/2010/wordprocessingCanvas" xmlns:cx="http://schemas.microsoft.com/office/drawing/2014/chartex" xmlns:cx1="http://schemas.microsoft.com/office/drawing/2015/9/8/chartex" xmlns:cx2="http://schemas.microsoft.com/office/drawing/2015/10/21/chartex" xmlns:cx3="http://schemas.microsoft.com/office/drawing/2016/5/9/chartex" xmlns:cx4="http://schemas.microsoft.com/office/drawing/2016/5/10/chartex" xmlns:cx5="http://schemas.microsoft.com/office/drawing/2016/5/11/chartex" xmlns:cx6="http://schemas.microsoft.com/office/drawing/2016/5/12/chartex" xmlns:cx7="http://schemas.microsoft.com/office/drawing/2016/5/13/chartex" xmlns:cx8="http://schemas.microsoft.com/office/drawing/2016/5/14/chartex" xmlns:mc="http://schemas.openxmlformats.org/markup-compatibility/2006" xmlns:aink="http://schemas.microsoft.com/office/drawing/2016/ink" xmlns:am3d="http://schemas.microsoft.com/office/drawing/2017/model3d" xmlns:o="urn:schemas-microsoft-com:office:office" xmlns:r="http://schemas.openxmlformats.org/officeDocument/2006/relationships" xmlns:m="http://schemas.openxmlformats.org/officeDocument/2006/math" xmlns:v="urn:schemas-microsoft-com:vml" xmlns:wp14="http://schemas.microsoft.com/office/word/2010/wordprocessingDrawing" xmlns:wp="http://schemas.openxmlformats.org/drawingml/2006/wordprocessingDrawing" xmlns:w10="urn:schemas-microsoft-com:office:word" xmlns:w="http://schemas.openxmlformats.org/wordprocessingml/2006/main" xmlns:w14="http://schemas.microsoft.com/office/word/2010/wordml" xmlns:w15="http://schemas.microsoft.com/office/word/2012/wordml" xmlns:w16cex="http://schemas.microsoft.com/office/word/2018/wordml/cex" xmlns:w16cid="http://schemas.microsoft.com/office/word/2016/wordml/cid" xmlns:w16="http://schemas.microsoft.com/office/word/2018/wordml" xmlns:w16sdtdh="http://schemas.microsoft.com/office/word/2020/wordml/sdtdatahash" xmlns:w16se="http://schemas.microsoft.com/office/word/2015/wordml/symex" xmlns:wpg="http://schemas.microsoft.com/office/word/2010/wordprocessingGroup" xmlns:wpi="http://schemas.microsoft.com/office/word/2010/wordprocessingInk" xmlns:wne="http://schemas.microsoft.com/office/word/2006/wordml" xmlns:wps="http://schemas.microsoft.com/office/word/2010/wordprocessingShape" mc:Ignorable="w14 w15 w16se w16cid w16 w16cex w16sdtdh wp14">
   <w:body>
     <w:p>
       <w:pPr>
@@ -72,6 +72,14 @@
           <w:szCs w:val="20"/>
         </w:rPr>
       </w:pPr>
+      <w:r>
+        <w:rPr>
+          <w:rFonts w:ascii="Palatino Linotype" w:eastAsia="MS Mincho" w:hAnsi="Palatino Linotype"/>
+          <w:sz w:val="20"/>
+          <w:szCs w:val="20"/>
+        </w:rPr>
+        <w:t>Dominic, Ethan, Carter</w:t>
+      </w:r>
     </w:p>
     <w:p>
       <w:pPr>
@@ -375,18 +383,8 @@
           <w:sz w:val="20"/>
           <w:szCs w:val="20"/>
         </w:rPr>
-        <w:t xml:space="preserve">, Simulink and </w:t>
-      </w:r>
-      <w:proofErr w:type="spellStart"/>
-      <w:r>
-        <w:rPr>
-          <w:rFonts w:ascii="Palatino Linotype" w:eastAsia="MS Mincho" w:hAnsi="Palatino Linotype"/>
-          <w:sz w:val="20"/>
-          <w:szCs w:val="20"/>
-        </w:rPr>
-        <w:t>Simscape</w:t>
-      </w:r>
-      <w:proofErr w:type="spellEnd"/>
+        <w:t>, Simulink and Simscape</w:t>
+      </w:r>
       <w:r>
         <w:rPr>
           <w:rFonts w:ascii="Palatino Linotype" w:eastAsia="MS Mincho" w:hAnsi="Palatino Linotype"/>
@@ -1096,7 +1094,6 @@
         </w:rPr>
         <w:t xml:space="preserve">Open the </w:t>
       </w:r>
-      <w:proofErr w:type="spellStart"/>
       <w:r>
         <w:rPr>
           <w:rFonts w:ascii="Palatino Linotype" w:hAnsi="Palatino Linotype"/>
@@ -1117,7 +1114,6 @@
         </w:rPr>
         <w:t>.slx</w:t>
       </w:r>
-      <w:proofErr w:type="spellEnd"/>
       <w:r>
         <w:rPr>
           <w:rFonts w:ascii="Palatino Linotype" w:hAnsi="Palatino Linotype"/>
@@ -1790,23 +1786,13 @@
         </w:rPr>
         <w:t xml:space="preserve"> Step time: </w:t>
       </w:r>
-      <w:proofErr w:type="spellStart"/>
-      <w:r>
-        <w:rPr>
-          <w:rFonts w:ascii="Palatino Linotype" w:hAnsi="Palatino Linotype"/>
-          <w:sz w:val="20"/>
-          <w:szCs w:val="20"/>
-        </w:rPr>
-        <w:t>Ttotal</w:t>
-      </w:r>
-      <w:proofErr w:type="spellEnd"/>
-      <w:r>
-        <w:rPr>
-          <w:rFonts w:ascii="Palatino Linotype" w:hAnsi="Palatino Linotype"/>
-          <w:sz w:val="20"/>
-          <w:szCs w:val="20"/>
-        </w:rPr>
-        <w:t>/2-900</w:t>
+      <w:r>
+        <w:rPr>
+          <w:rFonts w:ascii="Palatino Linotype" w:hAnsi="Palatino Linotype"/>
+          <w:sz w:val="20"/>
+          <w:szCs w:val="20"/>
+        </w:rPr>
+        <w:t>Ttotal/2-900</w:t>
       </w:r>
       <w:r>
         <w:rPr>
@@ -1816,23 +1802,13 @@
         </w:rPr>
         <w:t xml:space="preserve">, Initial value: </w:t>
       </w:r>
-      <w:proofErr w:type="spellStart"/>
-      <w:r>
-        <w:rPr>
-          <w:rFonts w:ascii="Palatino Linotype" w:hAnsi="Palatino Linotype"/>
-          <w:sz w:val="20"/>
-          <w:szCs w:val="20"/>
-        </w:rPr>
-        <w:t>C_nom</w:t>
-      </w:r>
-      <w:proofErr w:type="spellEnd"/>
-      <w:r>
-        <w:rPr>
-          <w:rFonts w:ascii="Palatino Linotype" w:hAnsi="Palatino Linotype"/>
-          <w:sz w:val="20"/>
-          <w:szCs w:val="20"/>
-        </w:rPr>
-        <w:t>/3</w:t>
+      <w:r>
+        <w:rPr>
+          <w:rFonts w:ascii="Palatino Linotype" w:hAnsi="Palatino Linotype"/>
+          <w:sz w:val="20"/>
+          <w:szCs w:val="20"/>
+        </w:rPr>
+        <w:t>C_nom/3</w:t>
       </w:r>
       <w:r>
         <w:rPr>
@@ -1848,25 +1824,7 @@
           <w:sz w:val="20"/>
           <w:szCs w:val="20"/>
         </w:rPr>
-        <w:t>-</w:t>
-      </w:r>
-      <w:proofErr w:type="spellStart"/>
-      <w:r>
-        <w:rPr>
-          <w:rFonts w:ascii="Palatino Linotype" w:hAnsi="Palatino Linotype"/>
-          <w:sz w:val="20"/>
-          <w:szCs w:val="20"/>
-        </w:rPr>
-        <w:t>C_nom</w:t>
-      </w:r>
-      <w:proofErr w:type="spellEnd"/>
-      <w:r>
-        <w:rPr>
-          <w:rFonts w:ascii="Palatino Linotype" w:hAnsi="Palatino Linotype"/>
-          <w:sz w:val="20"/>
-          <w:szCs w:val="20"/>
-        </w:rPr>
-        <w:t>/3</w:t>
+        <w:t>-C_nom/3</w:t>
       </w:r>
       <w:r>
         <w:rPr>
@@ -1952,43 +1910,7 @@
           <w:sz w:val="20"/>
           <w:szCs w:val="20"/>
         </w:rPr>
-        <w:t xml:space="preserve"> Initial condition: </w:t>
-      </w:r>
-      <w:proofErr w:type="spellStart"/>
-      <w:r>
-        <w:rPr>
-          <w:rFonts w:ascii="Palatino Linotype" w:hAnsi="Palatino Linotype"/>
-          <w:sz w:val="20"/>
-          <w:szCs w:val="20"/>
-        </w:rPr>
-        <w:t>C_init</w:t>
-      </w:r>
-      <w:proofErr w:type="spellEnd"/>
-      <w:r>
-        <w:rPr>
-          <w:rFonts w:ascii="Palatino Linotype" w:hAnsi="Palatino Linotype"/>
-          <w:sz w:val="20"/>
-          <w:szCs w:val="20"/>
-        </w:rPr>
-        <w:t xml:space="preserve">, Upper saturation limit: </w:t>
-      </w:r>
-      <w:proofErr w:type="spellStart"/>
-      <w:r>
-        <w:rPr>
-          <w:rFonts w:ascii="Palatino Linotype" w:hAnsi="Palatino Linotype"/>
-          <w:sz w:val="20"/>
-          <w:szCs w:val="20"/>
-        </w:rPr>
-        <w:t>C_total</w:t>
-      </w:r>
-      <w:proofErr w:type="spellEnd"/>
-      <w:r>
-        <w:rPr>
-          <w:rFonts w:ascii="Palatino Linotype" w:hAnsi="Palatino Linotype"/>
-          <w:sz w:val="20"/>
-          <w:szCs w:val="20"/>
-        </w:rPr>
-        <w:t xml:space="preserve">, </w:t>
+        <w:t xml:space="preserve"> Initial condition: C_init, Upper saturation limit: C_total, </w:t>
       </w:r>
       <w:r>
         <w:rPr>
@@ -2124,7 +2046,6 @@
         </w:rPr>
         <w:t xml:space="preserve">variable name: </w:t>
       </w:r>
-      <w:proofErr w:type="spellStart"/>
       <w:r>
         <w:rPr>
           <w:rFonts w:ascii="Palatino Linotype" w:hAnsi="Palatino Linotype"/>
@@ -2133,7 +2054,6 @@
         </w:rPr>
         <w:t>ScopeData</w:t>
       </w:r>
-      <w:proofErr w:type="spellEnd"/>
       <w:r>
         <w:rPr>
           <w:rFonts w:ascii="Palatino Linotype" w:hAnsi="Palatino Linotype"/>
@@ -2183,7 +2103,6 @@
         </w:rPr>
         <w:t xml:space="preserve">Once all the subsystems are developed, open the </w:t>
       </w:r>
-      <w:proofErr w:type="spellStart"/>
       <w:r>
         <w:rPr>
           <w:rFonts w:ascii="Palatino Linotype" w:hAnsi="Palatino Linotype"/>
@@ -2208,9 +2127,8 @@
           <w:sz w:val="20"/>
           <w:szCs w:val="20"/>
         </w:rPr>
-        <w:t>.m</w:t>
-      </w:r>
-      <w:proofErr w:type="spellEnd"/>
+        <w:t xml:space="preserve">.m file and run the program to produce </w:t>
+      </w:r>
       <w:r>
         <w:rPr>
           <w:rFonts w:ascii="Palatino Linotype" w:hAnsi="Palatino Linotype"/>
@@ -2222,7 +2140,7 @@
           <w:sz w:val="20"/>
           <w:szCs w:val="20"/>
         </w:rPr>
-        <w:t xml:space="preserve"> file and run the program to produce </w:t>
+        <w:t>two</w:t>
       </w:r>
       <w:r>
         <w:rPr>
@@ -2235,7 +2153,115 @@
           <w:sz w:val="20"/>
           <w:szCs w:val="20"/>
         </w:rPr>
-        <w:t>two</w:t>
+        <w:t xml:space="preserve"> figures.</w:t>
+      </w:r>
+      <w:r>
+        <w:rPr>
+          <w:rFonts w:ascii="Palatino Linotype" w:hAnsi="Palatino Linotype"/>
+          <w:sz w:val="20"/>
+          <w:szCs w:val="20"/>
+        </w:rPr>
+        <w:t xml:space="preserve"> Next run the </w:t>
+      </w:r>
+      <w:r>
+        <w:rPr>
+          <w:rFonts w:ascii="Palatino Linotype" w:hAnsi="Palatino Linotype"/>
+          <w:i/>
+          <w:iCs/>
+          <w:sz w:val="20"/>
+          <w:szCs w:val="20"/>
+        </w:rPr>
+        <w:t>Battery_Thevenin_Model_R</w:t>
+      </w:r>
+      <w:r>
+        <w:rPr>
+          <w:rFonts w:ascii="Palatino Linotype" w:hAnsi="Palatino Linotype"/>
+          <w:i/>
+          <w:iCs/>
+          <w:sz w:val="20"/>
+          <w:szCs w:val="20"/>
+        </w:rPr>
+        <w:t>.slx</w:t>
+      </w:r>
+      <w:r>
+        <w:rPr>
+          <w:rFonts w:ascii="Palatino Linotype" w:hAnsi="Palatino Linotype"/>
+          <w:sz w:val="20"/>
+          <w:szCs w:val="20"/>
+        </w:rPr>
+        <w:t xml:space="preserve"> file, wait for simulation to complete, and then run </w:t>
+      </w:r>
+      <w:r>
+        <w:rPr>
+          <w:rFonts w:ascii="Palatino Linotype" w:hAnsi="Palatino Linotype"/>
+          <w:i/>
+          <w:iCs/>
+          <w:sz w:val="20"/>
+          <w:szCs w:val="20"/>
+        </w:rPr>
+        <w:t>Battery_Plot_R.m</w:t>
+      </w:r>
+      <w:r>
+        <w:rPr>
+          <w:rFonts w:ascii="Palatino Linotype" w:hAnsi="Palatino Linotype"/>
+          <w:sz w:val="20"/>
+          <w:szCs w:val="20"/>
+        </w:rPr>
+        <w:t xml:space="preserve"> file to produce one figure.</w:t>
+      </w:r>
+      <w:r>
+        <w:rPr>
+          <w:rFonts w:ascii="Palatino Linotype" w:hAnsi="Palatino Linotype"/>
+          <w:sz w:val="20"/>
+          <w:szCs w:val="20"/>
+        </w:rPr>
+        <w:t xml:space="preserve"> Maximize all the figures. In the figure, go to </w:t>
+      </w:r>
+      <w:r>
+        <w:rPr>
+          <w:rFonts w:ascii="Palatino Linotype" w:hAnsi="Palatino Linotype"/>
+          <w:i/>
+          <w:iCs/>
+          <w:sz w:val="20"/>
+          <w:szCs w:val="20"/>
+        </w:rPr>
+        <w:t>Edit</w:t>
+      </w:r>
+      <w:r>
+        <w:rPr>
+          <w:rFonts w:ascii="Palatino Linotype" w:hAnsi="Palatino Linotype"/>
+          <w:sz w:val="20"/>
+          <w:szCs w:val="20"/>
+        </w:rPr>
+        <w:t xml:space="preserve"> tab and press </w:t>
+      </w:r>
+      <w:r>
+        <w:rPr>
+          <w:rFonts w:ascii="Palatino Linotype" w:hAnsi="Palatino Linotype"/>
+          <w:i/>
+          <w:iCs/>
+          <w:sz w:val="20"/>
+          <w:szCs w:val="20"/>
+        </w:rPr>
+        <w:t>Copy Figure</w:t>
+      </w:r>
+      <w:r>
+        <w:rPr>
+          <w:rFonts w:ascii="Palatino Linotype" w:hAnsi="Palatino Linotype"/>
+          <w:i/>
+          <w:iCs/>
+          <w:sz w:val="20"/>
+          <w:szCs w:val="20"/>
+        </w:rPr>
+        <w:t xml:space="preserve"> </w:t>
+      </w:r>
+      <w:r>
+        <w:rPr>
+          <w:rFonts w:ascii="Palatino Linotype" w:hAnsi="Palatino Linotype"/>
+          <w:sz w:val="20"/>
+          <w:szCs w:val="20"/>
+        </w:rPr>
+        <w:t xml:space="preserve">and paste in your lab report. </w:t>
       </w:r>
       <w:r>
         <w:rPr>
@@ -2248,131 +2274,6 @@
           <w:sz w:val="20"/>
           <w:szCs w:val="20"/>
         </w:rPr>
-        <w:t xml:space="preserve"> figures.</w:t>
-      </w:r>
-      <w:r>
-        <w:rPr>
-          <w:rFonts w:ascii="Palatino Linotype" w:hAnsi="Palatino Linotype"/>
-          <w:sz w:val="20"/>
-          <w:szCs w:val="20"/>
-        </w:rPr>
-        <w:t xml:space="preserve"> Next run the </w:t>
-      </w:r>
-      <w:proofErr w:type="spellStart"/>
-      <w:r>
-        <w:rPr>
-          <w:rFonts w:ascii="Palatino Linotype" w:hAnsi="Palatino Linotype"/>
-          <w:i/>
-          <w:iCs/>
-          <w:sz w:val="20"/>
-          <w:szCs w:val="20"/>
-        </w:rPr>
-        <w:t>Battery_Thevenin_Model_R</w:t>
-      </w:r>
-      <w:r>
-        <w:rPr>
-          <w:rFonts w:ascii="Palatino Linotype" w:hAnsi="Palatino Linotype"/>
-          <w:i/>
-          <w:iCs/>
-          <w:sz w:val="20"/>
-          <w:szCs w:val="20"/>
-        </w:rPr>
-        <w:t>.slx</w:t>
-      </w:r>
-      <w:proofErr w:type="spellEnd"/>
-      <w:r>
-        <w:rPr>
-          <w:rFonts w:ascii="Palatino Linotype" w:hAnsi="Palatino Linotype"/>
-          <w:sz w:val="20"/>
-          <w:szCs w:val="20"/>
-        </w:rPr>
-        <w:t xml:space="preserve"> file, wait for simulation to complete, and then run </w:t>
-      </w:r>
-      <w:proofErr w:type="spellStart"/>
-      <w:r>
-        <w:rPr>
-          <w:rFonts w:ascii="Palatino Linotype" w:hAnsi="Palatino Linotype"/>
-          <w:i/>
-          <w:iCs/>
-          <w:sz w:val="20"/>
-          <w:szCs w:val="20"/>
-        </w:rPr>
-        <w:t>Battery_Plot_R.m</w:t>
-      </w:r>
-      <w:proofErr w:type="spellEnd"/>
-      <w:r>
-        <w:rPr>
-          <w:rFonts w:ascii="Palatino Linotype" w:hAnsi="Palatino Linotype"/>
-          <w:sz w:val="20"/>
-          <w:szCs w:val="20"/>
-        </w:rPr>
-        <w:t xml:space="preserve"> file to produce one figure.</w:t>
-      </w:r>
-      <w:r>
-        <w:rPr>
-          <w:rFonts w:ascii="Palatino Linotype" w:hAnsi="Palatino Linotype"/>
-          <w:sz w:val="20"/>
-          <w:szCs w:val="20"/>
-        </w:rPr>
-        <w:t xml:space="preserve"> Maximize all the figures. In the figure, go to </w:t>
-      </w:r>
-      <w:r>
-        <w:rPr>
-          <w:rFonts w:ascii="Palatino Linotype" w:hAnsi="Palatino Linotype"/>
-          <w:i/>
-          <w:iCs/>
-          <w:sz w:val="20"/>
-          <w:szCs w:val="20"/>
-        </w:rPr>
-        <w:t>Edit</w:t>
-      </w:r>
-      <w:r>
-        <w:rPr>
-          <w:rFonts w:ascii="Palatino Linotype" w:hAnsi="Palatino Linotype"/>
-          <w:sz w:val="20"/>
-          <w:szCs w:val="20"/>
-        </w:rPr>
-        <w:t xml:space="preserve"> tab and press </w:t>
-      </w:r>
-      <w:r>
-        <w:rPr>
-          <w:rFonts w:ascii="Palatino Linotype" w:hAnsi="Palatino Linotype"/>
-          <w:i/>
-          <w:iCs/>
-          <w:sz w:val="20"/>
-          <w:szCs w:val="20"/>
-        </w:rPr>
-        <w:t>Copy Figure</w:t>
-      </w:r>
-      <w:r>
-        <w:rPr>
-          <w:rFonts w:ascii="Palatino Linotype" w:hAnsi="Palatino Linotype"/>
-          <w:i/>
-          <w:iCs/>
-          <w:sz w:val="20"/>
-          <w:szCs w:val="20"/>
-        </w:rPr>
-        <w:t xml:space="preserve"> </w:t>
-      </w:r>
-      <w:r>
-        <w:rPr>
-          <w:rFonts w:ascii="Palatino Linotype" w:hAnsi="Palatino Linotype"/>
-          <w:sz w:val="20"/>
-          <w:szCs w:val="20"/>
-        </w:rPr>
-        <w:t xml:space="preserve">and paste in your lab report. </w:t>
-      </w:r>
-      <w:r>
-        <w:rPr>
-          <w:rFonts w:ascii="Palatino Linotype" w:hAnsi="Palatino Linotype"/>
-          <w:b/>
-          <w:bCs/>
-          <w:i/>
-          <w:iCs/>
-          <w:color w:val="FF0000"/>
-          <w:sz w:val="20"/>
-          <w:szCs w:val="20"/>
-        </w:rPr>
         <w:t xml:space="preserve">Explain each plot thoroughly. Results without explanation will receive half the points only. Keep all the models you have developed in your report. </w:t>
       </w:r>
     </w:p>
@@ -2541,7 +2442,6 @@
         </w:rPr>
         <w:t xml:space="preserve">Open the </w:t>
       </w:r>
-      <w:proofErr w:type="spellStart"/>
       <w:r>
         <w:rPr>
           <w:rFonts w:ascii="Palatino Linotype" w:hAnsi="Palatino Linotype"/>
@@ -2572,7 +2472,6 @@
         </w:rPr>
         <w:t>.slx</w:t>
       </w:r>
-      <w:proofErr w:type="spellEnd"/>
       <w:r>
         <w:rPr>
           <w:rFonts w:ascii="Palatino Linotype" w:hAnsi="Palatino Linotype"/>
@@ -3081,23 +2980,13 @@
         </w:rPr>
         <w:t xml:space="preserve"> Amplitude: </w:t>
       </w:r>
-      <w:proofErr w:type="spellStart"/>
-      <w:r>
-        <w:rPr>
-          <w:rFonts w:ascii="Palatino Linotype" w:hAnsi="Palatino Linotype"/>
-          <w:sz w:val="20"/>
-          <w:szCs w:val="20"/>
-        </w:rPr>
-        <w:t>C_nom</w:t>
-      </w:r>
-      <w:proofErr w:type="spellEnd"/>
-      <w:r>
-        <w:rPr>
-          <w:rFonts w:ascii="Palatino Linotype" w:hAnsi="Palatino Linotype"/>
-          <w:sz w:val="20"/>
-          <w:szCs w:val="20"/>
-        </w:rPr>
-        <w:t>/6</w:t>
+      <w:r>
+        <w:rPr>
+          <w:rFonts w:ascii="Palatino Linotype" w:hAnsi="Palatino Linotype"/>
+          <w:sz w:val="20"/>
+          <w:szCs w:val="20"/>
+        </w:rPr>
+        <w:t>C_nom/6</w:t>
       </w:r>
       <w:r>
         <w:rPr>
@@ -3185,25 +3074,7 @@
           <w:sz w:val="20"/>
           <w:szCs w:val="20"/>
         </w:rPr>
-        <w:t>[Rs*</w:t>
-      </w:r>
-      <w:proofErr w:type="spellStart"/>
-      <w:r>
-        <w:rPr>
-          <w:rFonts w:ascii="Palatino Linotype" w:hAnsi="Palatino Linotype"/>
-          <w:sz w:val="20"/>
-          <w:szCs w:val="20"/>
-        </w:rPr>
-        <w:t>Rnl</w:t>
-      </w:r>
-      <w:proofErr w:type="spellEnd"/>
-      <w:r>
-        <w:rPr>
-          <w:rFonts w:ascii="Palatino Linotype" w:hAnsi="Palatino Linotype"/>
-          <w:sz w:val="20"/>
-          <w:szCs w:val="20"/>
-        </w:rPr>
-        <w:t>*Cd</w:t>
+        <w:t>[Rs*Rnl*Cd</w:t>
       </w:r>
       <w:r>
         <w:rPr>
@@ -3219,25 +3090,7 @@
           <w:sz w:val="20"/>
           <w:szCs w:val="20"/>
         </w:rPr>
-        <w:t>(</w:t>
-      </w:r>
-      <w:proofErr w:type="spellStart"/>
-      <w:r>
-        <w:rPr>
-          <w:rFonts w:ascii="Palatino Linotype" w:hAnsi="Palatino Linotype"/>
-          <w:sz w:val="20"/>
-          <w:szCs w:val="20"/>
-        </w:rPr>
-        <w:t>Rs+Rnl</w:t>
-      </w:r>
-      <w:proofErr w:type="spellEnd"/>
-      <w:r>
-        <w:rPr>
-          <w:rFonts w:ascii="Palatino Linotype" w:hAnsi="Palatino Linotype"/>
-          <w:sz w:val="20"/>
-          <w:szCs w:val="20"/>
-        </w:rPr>
-        <w:t>)]</w:t>
+        <w:t>(Rs+Rnl)]</w:t>
       </w:r>
       <w:r>
         <w:rPr>
@@ -3253,25 +3106,7 @@
           <w:sz w:val="20"/>
           <w:szCs w:val="20"/>
         </w:rPr>
-        <w:t>[</w:t>
-      </w:r>
-      <w:proofErr w:type="spellStart"/>
-      <w:r>
-        <w:rPr>
-          <w:rFonts w:ascii="Palatino Linotype" w:hAnsi="Palatino Linotype"/>
-          <w:sz w:val="20"/>
-          <w:szCs w:val="20"/>
-        </w:rPr>
-        <w:t>Rnl</w:t>
-      </w:r>
-      <w:proofErr w:type="spellEnd"/>
-      <w:r>
-        <w:rPr>
-          <w:rFonts w:ascii="Palatino Linotype" w:hAnsi="Palatino Linotype"/>
-          <w:sz w:val="20"/>
-          <w:szCs w:val="20"/>
-        </w:rPr>
-        <w:t>*Cd   1]</w:t>
+        <w:t>[Rnl*Cd   1]</w:t>
       </w:r>
     </w:p>
     <w:p>
@@ -3340,7 +3175,6 @@
         </w:rPr>
         <w:t xml:space="preserve"> Tick log data to workspace; variable name: </w:t>
       </w:r>
-      <w:proofErr w:type="spellStart"/>
       <w:r>
         <w:rPr>
           <w:rFonts w:ascii="Palatino Linotype" w:hAnsi="Palatino Linotype"/>
@@ -3349,7 +3183,6 @@
         </w:rPr>
         <w:t>ScopeData</w:t>
       </w:r>
-      <w:proofErr w:type="spellEnd"/>
       <w:r>
         <w:rPr>
           <w:rFonts w:ascii="Palatino Linotype" w:hAnsi="Palatino Linotype"/>
@@ -3398,9 +3231,8 @@
           <w:sz w:val="20"/>
           <w:szCs w:val="20"/>
         </w:rPr>
-        <w:t xml:space="preserve">Once all the subsystems are developed, open the </w:t>
-      </w:r>
-      <w:proofErr w:type="spellStart"/>
+        <w:t>Once all the subsystems are developed, open the Battery_Parameters_R</w:t>
+      </w:r>
       <w:r>
         <w:rPr>
           <w:rFonts w:ascii="Palatino Linotype" w:hAnsi="Palatino Linotype"/>
@@ -3412,7 +3244,7 @@
           <w:sz w:val="20"/>
           <w:szCs w:val="20"/>
         </w:rPr>
-        <w:t>Battery_Parameters_R</w:t>
+        <w:t>C</w:t>
       </w:r>
       <w:r>
         <w:rPr>
@@ -3425,53 +3257,45 @@
           <w:sz w:val="20"/>
           <w:szCs w:val="20"/>
         </w:rPr>
-        <w:t>C</w:t>
-      </w:r>
-      <w:r>
-        <w:rPr>
-          <w:rFonts w:ascii="Palatino Linotype" w:hAnsi="Palatino Linotype"/>
-          <w:b/>
-          <w:bCs/>
+        <w:t>.m file and run the program to produce two figures.</w:t>
+      </w:r>
+      <w:r>
+        <w:rPr>
+          <w:rFonts w:ascii="Palatino Linotype" w:hAnsi="Palatino Linotype"/>
+          <w:color w:val="FF0000"/>
+          <w:sz w:val="20"/>
+          <w:szCs w:val="20"/>
+        </w:rPr>
+        <w:t xml:space="preserve"> </w:t>
+      </w:r>
+      <w:r>
+        <w:rPr>
+          <w:rFonts w:ascii="Palatino Linotype" w:hAnsi="Palatino Linotype"/>
+          <w:sz w:val="20"/>
+          <w:szCs w:val="20"/>
+        </w:rPr>
+        <w:t xml:space="preserve">Next run the </w:t>
+      </w:r>
+      <w:r>
+        <w:rPr>
+          <w:rFonts w:ascii="Palatino Linotype" w:hAnsi="Palatino Linotype"/>
           <w:i/>
           <w:iCs/>
-          <w:color w:val="FF0000"/>
-          <w:sz w:val="20"/>
-          <w:szCs w:val="20"/>
-        </w:rPr>
-        <w:t>.m</w:t>
-      </w:r>
-      <w:proofErr w:type="spellEnd"/>
-      <w:r>
-        <w:rPr>
-          <w:rFonts w:ascii="Palatino Linotype" w:hAnsi="Palatino Linotype"/>
-          <w:b/>
-          <w:bCs/>
+          <w:sz w:val="20"/>
+          <w:szCs w:val="20"/>
+        </w:rPr>
+        <w:t>Battery_Thevenin_Model_R</w:t>
+      </w:r>
+      <w:r>
+        <w:rPr>
+          <w:rFonts w:ascii="Palatino Linotype" w:hAnsi="Palatino Linotype"/>
           <w:i/>
           <w:iCs/>
-          <w:color w:val="FF0000"/>
-          <w:sz w:val="20"/>
-          <w:szCs w:val="20"/>
-        </w:rPr>
-        <w:t xml:space="preserve"> file and run the program to produce two figures.</w:t>
-      </w:r>
-      <w:r>
-        <w:rPr>
-          <w:rFonts w:ascii="Palatino Linotype" w:hAnsi="Palatino Linotype"/>
-          <w:color w:val="FF0000"/>
-          <w:sz w:val="20"/>
-          <w:szCs w:val="20"/>
-        </w:rPr>
-        <w:t xml:space="preserve"> </w:t>
-      </w:r>
-      <w:r>
-        <w:rPr>
-          <w:rFonts w:ascii="Palatino Linotype" w:hAnsi="Palatino Linotype"/>
-          <w:sz w:val="20"/>
-          <w:szCs w:val="20"/>
-        </w:rPr>
-        <w:t xml:space="preserve">Next run the </w:t>
-      </w:r>
-      <w:proofErr w:type="spellStart"/>
+          <w:sz w:val="20"/>
+          <w:szCs w:val="20"/>
+        </w:rPr>
+        <w:t>C</w:t>
+      </w:r>
       <w:r>
         <w:rPr>
           <w:rFonts w:ascii="Palatino Linotype" w:hAnsi="Palatino Linotype"/>
@@ -3480,7 +3304,15 @@
           <w:sz w:val="20"/>
           <w:szCs w:val="20"/>
         </w:rPr>
-        <w:t>Battery_Thevenin_Model_R</w:t>
+        <w:t>.slx</w:t>
+      </w:r>
+      <w:r>
+        <w:rPr>
+          <w:rFonts w:ascii="Palatino Linotype" w:hAnsi="Palatino Linotype"/>
+          <w:sz w:val="20"/>
+          <w:szCs w:val="20"/>
+        </w:rPr>
+        <w:t xml:space="preserve"> file, wait for simulation to complete, and then run </w:t>
       </w:r>
       <w:r>
         <w:rPr>
@@ -3490,7 +3322,7 @@
           <w:sz w:val="20"/>
           <w:szCs w:val="20"/>
         </w:rPr>
-        <w:t>C</w:t>
+        <w:t>Battery_Plot_R</w:t>
       </w:r>
       <w:r>
         <w:rPr>
@@ -3500,18 +3332,8 @@
           <w:sz w:val="20"/>
           <w:szCs w:val="20"/>
         </w:rPr>
-        <w:t>.slx</w:t>
-      </w:r>
-      <w:proofErr w:type="spellEnd"/>
-      <w:r>
-        <w:rPr>
-          <w:rFonts w:ascii="Palatino Linotype" w:hAnsi="Palatino Linotype"/>
-          <w:sz w:val="20"/>
-          <w:szCs w:val="20"/>
-        </w:rPr>
-        <w:t xml:space="preserve"> file, wait for simulation to complete, and then run </w:t>
-      </w:r>
-      <w:proofErr w:type="spellStart"/>
+        <w:t>C</w:t>
+      </w:r>
       <w:r>
         <w:rPr>
           <w:rFonts w:ascii="Palatino Linotype" w:hAnsi="Palatino Linotype"/>
@@ -3520,29 +3342,8 @@
           <w:sz w:val="20"/>
           <w:szCs w:val="20"/>
         </w:rPr>
-        <w:t>Battery_Plot_R</w:t>
-      </w:r>
-      <w:r>
-        <w:rPr>
-          <w:rFonts w:ascii="Palatino Linotype" w:hAnsi="Palatino Linotype"/>
-          <w:i/>
-          <w:iCs/>
-          <w:sz w:val="20"/>
-          <w:szCs w:val="20"/>
-        </w:rPr>
-        <w:t>C</w:t>
-      </w:r>
-      <w:r>
-        <w:rPr>
-          <w:rFonts w:ascii="Palatino Linotype" w:hAnsi="Palatino Linotype"/>
-          <w:i/>
-          <w:iCs/>
-          <w:sz w:val="20"/>
-          <w:szCs w:val="20"/>
-        </w:rPr>
         <w:t>.m</w:t>
       </w:r>
-      <w:proofErr w:type="spellEnd"/>
       <w:r>
         <w:rPr>
           <w:rFonts w:ascii="Palatino Linotype" w:hAnsi="Palatino Linotype"/>
@@ -4025,7 +3826,7 @@
 </file>
 
 <file path=word/endnotes.xml><?xml version="1.0" encoding="utf-8"?>
-<w:endnotes xmlns:wpc="http://schemas.microsoft.com/office/word/2010/wordprocessingCanvas" xmlns:cx="http://schemas.microsoft.com/office/drawing/2014/chartex" xmlns:cx1="http://schemas.microsoft.com/office/drawing/2015/9/8/chartex" xmlns:cx2="http://schemas.microsoft.com/office/drawing/2015/10/21/chartex" xmlns:cx3="http://schemas.microsoft.com/office/drawing/2016/5/9/chartex" xmlns:cx4="http://schemas.microsoft.com/office/drawing/2016/5/10/chartex" xmlns:cx5="http://schemas.microsoft.com/office/drawing/2016/5/11/chartex" xmlns:cx6="http://schemas.microsoft.com/office/drawing/2016/5/12/chartex" xmlns:cx7="http://schemas.microsoft.com/office/drawing/2016/5/13/chartex" xmlns:cx8="http://schemas.microsoft.com/office/drawing/2016/5/14/chartex" xmlns:mc="http://schemas.openxmlformats.org/markup-compatibility/2006" xmlns:aink="http://schemas.microsoft.com/office/drawing/2016/ink" xmlns:am3d="http://schemas.microsoft.com/office/drawing/2017/model3d" xmlns:o="urn:schemas-microsoft-com:office:office" xmlns:oel="http://schemas.microsoft.com/office/2019/extlst" xmlns:r="http://schemas.openxmlformats.org/officeDocument/2006/relationships" xmlns:m="http://schemas.openxmlformats.org/officeDocument/2006/math" xmlns:v="urn:schemas-microsoft-com:vml" xmlns:wp14="http://schemas.microsoft.com/office/word/2010/wordprocessingDrawing" xmlns:wp="http://schemas.openxmlformats.org/drawingml/2006/wordprocessingDrawing" xmlns:w10="urn:schemas-microsoft-com:office:word" xmlns:w="http://schemas.openxmlformats.org/wordprocessingml/2006/main" xmlns:w14="http://schemas.microsoft.com/office/word/2010/wordml" xmlns:w15="http://schemas.microsoft.com/office/word/2012/wordml" xmlns:w16cex="http://schemas.microsoft.com/office/word/2018/wordml/cex" xmlns:w16cid="http://schemas.microsoft.com/office/word/2016/wordml/cid" xmlns:w16="http://schemas.microsoft.com/office/word/2018/wordml" xmlns:w16du="http://schemas.microsoft.com/office/word/2023/wordml/word16du" xmlns:w16sdtdh="http://schemas.microsoft.com/office/word/2020/wordml/sdtdatahash" xmlns:w16sdtfl="http://schemas.microsoft.com/office/word/2024/wordml/sdtformatlock" xmlns:w16se="http://schemas.microsoft.com/office/word/2015/wordml/symex" xmlns:wpg="http://schemas.microsoft.com/office/word/2010/wordprocessingGroup" xmlns:wpi="http://schemas.microsoft.com/office/word/2010/wordprocessingInk" xmlns:wne="http://schemas.microsoft.com/office/word/2006/wordml" xmlns:wps="http://schemas.microsoft.com/office/word/2010/wordprocessingShape" mc:Ignorable="w14 w15 w16se w16cid w16 w16cex w16sdtdh w16sdtfl w16du wp14">
+<w:endnotes xmlns:wpc="http://schemas.microsoft.com/office/word/2010/wordprocessingCanvas" xmlns:cx="http://schemas.microsoft.com/office/drawing/2014/chartex" xmlns:cx1="http://schemas.microsoft.com/office/drawing/2015/9/8/chartex" xmlns:cx2="http://schemas.microsoft.com/office/drawing/2015/10/21/chartex" xmlns:cx3="http://schemas.microsoft.com/office/drawing/2016/5/9/chartex" xmlns:cx4="http://schemas.microsoft.com/office/drawing/2016/5/10/chartex" xmlns:cx5="http://schemas.microsoft.com/office/drawing/2016/5/11/chartex" xmlns:cx6="http://schemas.microsoft.com/office/drawing/2016/5/12/chartex" xmlns:cx7="http://schemas.microsoft.com/office/drawing/2016/5/13/chartex" xmlns:cx8="http://schemas.microsoft.com/office/drawing/2016/5/14/chartex" xmlns:mc="http://schemas.openxmlformats.org/markup-compatibility/2006" xmlns:aink="http://schemas.microsoft.com/office/drawing/2016/ink" xmlns:am3d="http://schemas.microsoft.com/office/drawing/2017/model3d" xmlns:o="urn:schemas-microsoft-com:office:office" xmlns:r="http://schemas.openxmlformats.org/officeDocument/2006/relationships" xmlns:m="http://schemas.openxmlformats.org/officeDocument/2006/math" xmlns:v="urn:schemas-microsoft-com:vml" xmlns:wp14="http://schemas.microsoft.com/office/word/2010/wordprocessingDrawing" xmlns:wp="http://schemas.openxmlformats.org/drawingml/2006/wordprocessingDrawing" xmlns:w10="urn:schemas-microsoft-com:office:word" xmlns:w="http://schemas.openxmlformats.org/wordprocessingml/2006/main" xmlns:w14="http://schemas.microsoft.com/office/word/2010/wordml" xmlns:w15="http://schemas.microsoft.com/office/word/2012/wordml" xmlns:w16cex="http://schemas.microsoft.com/office/word/2018/wordml/cex" xmlns:w16cid="http://schemas.microsoft.com/office/word/2016/wordml/cid" xmlns:w16="http://schemas.microsoft.com/office/word/2018/wordml" xmlns:w16sdtdh="http://schemas.microsoft.com/office/word/2020/wordml/sdtdatahash" xmlns:w16se="http://schemas.microsoft.com/office/word/2015/wordml/symex" xmlns:wpg="http://schemas.microsoft.com/office/word/2010/wordprocessingGroup" xmlns:wpi="http://schemas.microsoft.com/office/word/2010/wordprocessingInk" xmlns:wne="http://schemas.microsoft.com/office/word/2006/wordml" xmlns:wps="http://schemas.microsoft.com/office/word/2010/wordprocessingShape" mc:Ignorable="w14 w15 w16se w16cid w16 w16cex w16sdtdh wp14">
   <w:endnote w:type="separator" w:id="-1">
     <w:p>
       <w:r>
@@ -4044,7 +3845,7 @@
 </file>
 
 <file path=word/footer1.xml><?xml version="1.0" encoding="utf-8"?>
-<w:ftr xmlns:wpc="http://schemas.microsoft.com/office/word/2010/wordprocessingCanvas" xmlns:cx="http://schemas.microsoft.com/office/drawing/2014/chartex" xmlns:cx1="http://schemas.microsoft.com/office/drawing/2015/9/8/chartex" xmlns:cx2="http://schemas.microsoft.com/office/drawing/2015/10/21/chartex" xmlns:cx3="http://schemas.microsoft.com/office/drawing/2016/5/9/chartex" xmlns:cx4="http://schemas.microsoft.com/office/drawing/2016/5/10/chartex" xmlns:cx5="http://schemas.microsoft.com/office/drawing/2016/5/11/chartex" xmlns:cx6="http://schemas.microsoft.com/office/drawing/2016/5/12/chartex" xmlns:cx7="http://schemas.microsoft.com/office/drawing/2016/5/13/chartex" xmlns:cx8="http://schemas.microsoft.com/office/drawing/2016/5/14/chartex" xmlns:mc="http://schemas.openxmlformats.org/markup-compatibility/2006" xmlns:aink="http://schemas.microsoft.com/office/drawing/2016/ink" xmlns:am3d="http://schemas.microsoft.com/office/drawing/2017/model3d" xmlns:o="urn:schemas-microsoft-com:office:office" xmlns:oel="http://schemas.microsoft.com/office/2019/extlst" xmlns:r="http://schemas.openxmlformats.org/officeDocument/2006/relationships" xmlns:m="http://schemas.openxmlformats.org/officeDocument/2006/math" xmlns:v="urn:schemas-microsoft-com:vml" xmlns:wp14="http://schemas.microsoft.com/office/word/2010/wordprocessingDrawing" xmlns:wp="http://schemas.openxmlformats.org/drawingml/2006/wordprocessingDrawing" xmlns:w10="urn:schemas-microsoft-com:office:word" xmlns:w="http://schemas.openxmlformats.org/wordprocessingml/2006/main" xmlns:w14="http://schemas.microsoft.com/office/word/2010/wordml" xmlns:w15="http://schemas.microsoft.com/office/word/2012/wordml" xmlns:w16cex="http://schemas.microsoft.com/office/word/2018/wordml/cex" xmlns:w16cid="http://schemas.microsoft.com/office/word/2016/wordml/cid" xmlns:w16="http://schemas.microsoft.com/office/word/2018/wordml" xmlns:w16du="http://schemas.microsoft.com/office/word/2023/wordml/word16du" xmlns:w16sdtdh="http://schemas.microsoft.com/office/word/2020/wordml/sdtdatahash" xmlns:w16sdtfl="http://schemas.microsoft.com/office/word/2024/wordml/sdtformatlock" xmlns:w16se="http://schemas.microsoft.com/office/word/2015/wordml/symex" xmlns:wpg="http://schemas.microsoft.com/office/word/2010/wordprocessingGroup" xmlns:wpi="http://schemas.microsoft.com/office/word/2010/wordprocessingInk" xmlns:wne="http://schemas.microsoft.com/office/word/2006/wordml" xmlns:wps="http://schemas.microsoft.com/office/word/2010/wordprocessingShape" mc:Ignorable="w14 w15 w16se w16cid w16 w16cex w16sdtdh w16sdtfl w16du wp14">
+<w:ftr xmlns:wpc="http://schemas.microsoft.com/office/word/2010/wordprocessingCanvas" xmlns:cx="http://schemas.microsoft.com/office/drawing/2014/chartex" xmlns:cx1="http://schemas.microsoft.com/office/drawing/2015/9/8/chartex" xmlns:cx2="http://schemas.microsoft.com/office/drawing/2015/10/21/chartex" xmlns:cx3="http://schemas.microsoft.com/office/drawing/2016/5/9/chartex" xmlns:cx4="http://schemas.microsoft.com/office/drawing/2016/5/10/chartex" xmlns:cx5="http://schemas.microsoft.com/office/drawing/2016/5/11/chartex" xmlns:cx6="http://schemas.microsoft.com/office/drawing/2016/5/12/chartex" xmlns:cx7="http://schemas.microsoft.com/office/drawing/2016/5/13/chartex" xmlns:cx8="http://schemas.microsoft.com/office/drawing/2016/5/14/chartex" xmlns:mc="http://schemas.openxmlformats.org/markup-compatibility/2006" xmlns:aink="http://schemas.microsoft.com/office/drawing/2016/ink" xmlns:am3d="http://schemas.microsoft.com/office/drawing/2017/model3d" xmlns:o="urn:schemas-microsoft-com:office:office" xmlns:r="http://schemas.openxmlformats.org/officeDocument/2006/relationships" xmlns:m="http://schemas.openxmlformats.org/officeDocument/2006/math" xmlns:v="urn:schemas-microsoft-com:vml" xmlns:wp14="http://schemas.microsoft.com/office/word/2010/wordprocessingDrawing" xmlns:wp="http://schemas.openxmlformats.org/drawingml/2006/wordprocessingDrawing" xmlns:w10="urn:schemas-microsoft-com:office:word" xmlns:w="http://schemas.openxmlformats.org/wordprocessingml/2006/main" xmlns:w14="http://schemas.microsoft.com/office/word/2010/wordml" xmlns:w15="http://schemas.microsoft.com/office/word/2012/wordml" xmlns:w16cex="http://schemas.microsoft.com/office/word/2018/wordml/cex" xmlns:w16cid="http://schemas.microsoft.com/office/word/2016/wordml/cid" xmlns:w16="http://schemas.microsoft.com/office/word/2018/wordml" xmlns:w16sdtdh="http://schemas.microsoft.com/office/word/2020/wordml/sdtdatahash" xmlns:w16se="http://schemas.microsoft.com/office/word/2015/wordml/symex" xmlns:wpg="http://schemas.microsoft.com/office/word/2010/wordprocessingGroup" xmlns:wpi="http://schemas.microsoft.com/office/word/2010/wordprocessingInk" xmlns:wne="http://schemas.microsoft.com/office/word/2006/wordml" xmlns:wps="http://schemas.microsoft.com/office/word/2010/wordprocessingShape" mc:Ignorable="w14 w15 w16se w16cid w16 w16cex w16sdtdh wp14">
   <w:sdt>
     <w:sdtPr>
       <w:rPr>
@@ -4056,6 +3857,11 @@
         <w:docPartUnique/>
       </w:docPartObj>
     </w:sdtPr>
+    <w:sdtEndPr>
+      <w:rPr>
+        <w:rStyle w:val="PageNumber"/>
+      </w:rPr>
+    </w:sdtEndPr>
     <w:sdtContent>
       <w:p>
         <w:pPr>
@@ -4096,7 +3902,7 @@
 </file>
 
 <file path=word/footer2.xml><?xml version="1.0" encoding="utf-8"?>
-<w:ftr xmlns:wpc="http://schemas.microsoft.com/office/word/2010/wordprocessingCanvas" xmlns:cx="http://schemas.microsoft.com/office/drawing/2014/chartex" xmlns:cx1="http://schemas.microsoft.com/office/drawing/2015/9/8/chartex" xmlns:cx2="http://schemas.microsoft.com/office/drawing/2015/10/21/chartex" xmlns:cx3="http://schemas.microsoft.com/office/drawing/2016/5/9/chartex" xmlns:cx4="http://schemas.microsoft.com/office/drawing/2016/5/10/chartex" xmlns:cx5="http://schemas.microsoft.com/office/drawing/2016/5/11/chartex" xmlns:cx6="http://schemas.microsoft.com/office/drawing/2016/5/12/chartex" xmlns:cx7="http://schemas.microsoft.com/office/drawing/2016/5/13/chartex" xmlns:cx8="http://schemas.microsoft.com/office/drawing/2016/5/14/chartex" xmlns:mc="http://schemas.openxmlformats.org/markup-compatibility/2006" xmlns:aink="http://schemas.microsoft.com/office/drawing/2016/ink" xmlns:am3d="http://schemas.microsoft.com/office/drawing/2017/model3d" xmlns:o="urn:schemas-microsoft-com:office:office" xmlns:oel="http://schemas.microsoft.com/office/2019/extlst" xmlns:r="http://schemas.openxmlformats.org/officeDocument/2006/relationships" xmlns:m="http://schemas.openxmlformats.org/officeDocument/2006/math" xmlns:v="urn:schemas-microsoft-com:vml" xmlns:wp14="http://schemas.microsoft.com/office/word/2010/wordprocessingDrawing" xmlns:wp="http://schemas.openxmlformats.org/drawingml/2006/wordprocessingDrawing" xmlns:w10="urn:schemas-microsoft-com:office:word" xmlns:w="http://schemas.openxmlformats.org/wordprocessingml/2006/main" xmlns:w14="http://schemas.microsoft.com/office/word/2010/wordml" xmlns:w15="http://schemas.microsoft.com/office/word/2012/wordml" xmlns:w16cex="http://schemas.microsoft.com/office/word/2018/wordml/cex" xmlns:w16cid="http://schemas.microsoft.com/office/word/2016/wordml/cid" xmlns:w16="http://schemas.microsoft.com/office/word/2018/wordml" xmlns:w16du="http://schemas.microsoft.com/office/word/2023/wordml/word16du" xmlns:w16sdtdh="http://schemas.microsoft.com/office/word/2020/wordml/sdtdatahash" xmlns:w16sdtfl="http://schemas.microsoft.com/office/word/2024/wordml/sdtformatlock" xmlns:w16se="http://schemas.microsoft.com/office/word/2015/wordml/symex" xmlns:wpg="http://schemas.microsoft.com/office/word/2010/wordprocessingGroup" xmlns:wpi="http://schemas.microsoft.com/office/word/2010/wordprocessingInk" xmlns:wne="http://schemas.microsoft.com/office/word/2006/wordml" xmlns:wps="http://schemas.microsoft.com/office/word/2010/wordprocessingShape" mc:Ignorable="w14 w15 w16se w16cid w16 w16cex w16sdtdh w16sdtfl w16du wp14">
+<w:ftr xmlns:wpc="http://schemas.microsoft.com/office/word/2010/wordprocessingCanvas" xmlns:cx="http://schemas.microsoft.com/office/drawing/2014/chartex" xmlns:cx1="http://schemas.microsoft.com/office/drawing/2015/9/8/chartex" xmlns:cx2="http://schemas.microsoft.com/office/drawing/2015/10/21/chartex" xmlns:cx3="http://schemas.microsoft.com/office/drawing/2016/5/9/chartex" xmlns:cx4="http://schemas.microsoft.com/office/drawing/2016/5/10/chartex" xmlns:cx5="http://schemas.microsoft.com/office/drawing/2016/5/11/chartex" xmlns:cx6="http://schemas.microsoft.com/office/drawing/2016/5/12/chartex" xmlns:cx7="http://schemas.microsoft.com/office/drawing/2016/5/13/chartex" xmlns:cx8="http://schemas.microsoft.com/office/drawing/2016/5/14/chartex" xmlns:mc="http://schemas.openxmlformats.org/markup-compatibility/2006" xmlns:aink="http://schemas.microsoft.com/office/drawing/2016/ink" xmlns:am3d="http://schemas.microsoft.com/office/drawing/2017/model3d" xmlns:o="urn:schemas-microsoft-com:office:office" xmlns:r="http://schemas.openxmlformats.org/officeDocument/2006/relationships" xmlns:m="http://schemas.openxmlformats.org/officeDocument/2006/math" xmlns:v="urn:schemas-microsoft-com:vml" xmlns:wp14="http://schemas.microsoft.com/office/word/2010/wordprocessingDrawing" xmlns:wp="http://schemas.openxmlformats.org/drawingml/2006/wordprocessingDrawing" xmlns:w10="urn:schemas-microsoft-com:office:word" xmlns:w="http://schemas.openxmlformats.org/wordprocessingml/2006/main" xmlns:w14="http://schemas.microsoft.com/office/word/2010/wordml" xmlns:w15="http://schemas.microsoft.com/office/word/2012/wordml" xmlns:w16cex="http://schemas.microsoft.com/office/word/2018/wordml/cex" xmlns:w16cid="http://schemas.microsoft.com/office/word/2016/wordml/cid" xmlns:w16="http://schemas.microsoft.com/office/word/2018/wordml" xmlns:w16sdtdh="http://schemas.microsoft.com/office/word/2020/wordml/sdtdatahash" xmlns:w16se="http://schemas.microsoft.com/office/word/2015/wordml/symex" xmlns:wpg="http://schemas.microsoft.com/office/word/2010/wordprocessingGroup" xmlns:wpi="http://schemas.microsoft.com/office/word/2010/wordprocessingInk" xmlns:wne="http://schemas.microsoft.com/office/word/2006/wordml" xmlns:wps="http://schemas.microsoft.com/office/word/2010/wordprocessingShape" mc:Ignorable="w14 w15 w16se w16cid w16 w16cex w16sdtdh wp14">
   <w:sdt>
     <w:sdtPr>
       <w:rPr>
@@ -4111,6 +3917,7 @@
         <w:docPartUnique/>
       </w:docPartObj>
     </w:sdtPr>
+    <w:sdtEndPr/>
     <w:sdtContent>
       <w:sdt>
         <w:sdtPr>
@@ -4126,6 +3933,7 @@
             <w:docPartUnique/>
           </w:docPartObj>
         </w:sdtPr>
+        <w:sdtEndPr/>
         <w:sdtContent>
           <w:p>
             <w:pPr>
@@ -4283,7 +4091,7 @@
 </file>
 
 <file path=word/footnotes.xml><?xml version="1.0" encoding="utf-8"?>
-<w:footnotes xmlns:wpc="http://schemas.microsoft.com/office/word/2010/wordprocessingCanvas" xmlns:cx="http://schemas.microsoft.com/office/drawing/2014/chartex" xmlns:cx1="http://schemas.microsoft.com/office/drawing/2015/9/8/chartex" xmlns:cx2="http://schemas.microsoft.com/office/drawing/2015/10/21/chartex" xmlns:cx3="http://schemas.microsoft.com/office/drawing/2016/5/9/chartex" xmlns:cx4="http://schemas.microsoft.com/office/drawing/2016/5/10/chartex" xmlns:cx5="http://schemas.microsoft.com/office/drawing/2016/5/11/chartex" xmlns:cx6="http://schemas.microsoft.com/office/drawing/2016/5/12/chartex" xmlns:cx7="http://schemas.microsoft.com/office/drawing/2016/5/13/chartex" xmlns:cx8="http://schemas.microsoft.com/office/drawing/2016/5/14/chartex" xmlns:mc="http://schemas.openxmlformats.org/markup-compatibility/2006" xmlns:aink="http://schemas.microsoft.com/office/drawing/2016/ink" xmlns:am3d="http://schemas.microsoft.com/office/drawing/2017/model3d" xmlns:o="urn:schemas-microsoft-com:office:office" xmlns:oel="http://schemas.microsoft.com/office/2019/extlst" xmlns:r="http://schemas.openxmlformats.org/officeDocument/2006/relationships" xmlns:m="http://schemas.openxmlformats.org/officeDocument/2006/math" xmlns:v="urn:schemas-microsoft-com:vml" xmlns:wp14="http://schemas.microsoft.com/office/word/2010/wordprocessingDrawing" xmlns:wp="http://schemas.openxmlformats.org/drawingml/2006/wordprocessingDrawing" xmlns:w10="urn:schemas-microsoft-com:office:word" xmlns:w="http://schemas.openxmlformats.org/wordprocessingml/2006/main" xmlns:w14="http://schemas.microsoft.com/office/word/2010/wordml" xmlns:w15="http://schemas.microsoft.com/office/word/2012/wordml" xmlns:w16cex="http://schemas.microsoft.com/office/word/2018/wordml/cex" xmlns:w16cid="http://schemas.microsoft.com/office/word/2016/wordml/cid" xmlns:w16="http://schemas.microsoft.com/office/word/2018/wordml" xmlns:w16du="http://schemas.microsoft.com/office/word/2023/wordml/word16du" xmlns:w16sdtdh="http://schemas.microsoft.com/office/word/2020/wordml/sdtdatahash" xmlns:w16sdtfl="http://schemas.microsoft.com/office/word/2024/wordml/sdtformatlock" xmlns:w16se="http://schemas.microsoft.com/office/word/2015/wordml/symex" xmlns:wpg="http://schemas.microsoft.com/office/word/2010/wordprocessingGroup" xmlns:wpi="http://schemas.microsoft.com/office/word/2010/wordprocessingInk" xmlns:wne="http://schemas.microsoft.com/office/word/2006/wordml" xmlns:wps="http://schemas.microsoft.com/office/word/2010/wordprocessingShape" mc:Ignorable="w14 w15 w16se w16cid w16 w16cex w16sdtdh w16sdtfl w16du wp14">
+<w:footnotes xmlns:wpc="http://schemas.microsoft.com/office/word/2010/wordprocessingCanvas" xmlns:cx="http://schemas.microsoft.com/office/drawing/2014/chartex" xmlns:cx1="http://schemas.microsoft.com/office/drawing/2015/9/8/chartex" xmlns:cx2="http://schemas.microsoft.com/office/drawing/2015/10/21/chartex" xmlns:cx3="http://schemas.microsoft.com/office/drawing/2016/5/9/chartex" xmlns:cx4="http://schemas.microsoft.com/office/drawing/2016/5/10/chartex" xmlns:cx5="http://schemas.microsoft.com/office/drawing/2016/5/11/chartex" xmlns:cx6="http://schemas.microsoft.com/office/drawing/2016/5/12/chartex" xmlns:cx7="http://schemas.microsoft.com/office/drawing/2016/5/13/chartex" xmlns:cx8="http://schemas.microsoft.com/office/drawing/2016/5/14/chartex" xmlns:mc="http://schemas.openxmlformats.org/markup-compatibility/2006" xmlns:aink="http://schemas.microsoft.com/office/drawing/2016/ink" xmlns:am3d="http://schemas.microsoft.com/office/drawing/2017/model3d" xmlns:o="urn:schemas-microsoft-com:office:office" xmlns:r="http://schemas.openxmlformats.org/officeDocument/2006/relationships" xmlns:m="http://schemas.openxmlformats.org/officeDocument/2006/math" xmlns:v="urn:schemas-microsoft-com:vml" xmlns:wp14="http://schemas.microsoft.com/office/word/2010/wordprocessingDrawing" xmlns:wp="http://schemas.openxmlformats.org/drawingml/2006/wordprocessingDrawing" xmlns:w10="urn:schemas-microsoft-com:office:word" xmlns:w="http://schemas.openxmlformats.org/wordprocessingml/2006/main" xmlns:w14="http://schemas.microsoft.com/office/word/2010/wordml" xmlns:w15="http://schemas.microsoft.com/office/word/2012/wordml" xmlns:w16cex="http://schemas.microsoft.com/office/word/2018/wordml/cex" xmlns:w16cid="http://schemas.microsoft.com/office/word/2016/wordml/cid" xmlns:w16="http://schemas.microsoft.com/office/word/2018/wordml" xmlns:w16sdtdh="http://schemas.microsoft.com/office/word/2020/wordml/sdtdatahash" xmlns:w16se="http://schemas.microsoft.com/office/word/2015/wordml/symex" xmlns:wpg="http://schemas.microsoft.com/office/word/2010/wordprocessingGroup" xmlns:wpi="http://schemas.microsoft.com/office/word/2010/wordprocessingInk" xmlns:wne="http://schemas.microsoft.com/office/word/2006/wordml" xmlns:wps="http://schemas.microsoft.com/office/word/2010/wordprocessingShape" mc:Ignorable="w14 w15 w16se w16cid w16 w16cex w16sdtdh wp14">
   <w:footnote w:type="separator" w:id="-1">
     <w:p>
       <w:r>
@@ -4302,7 +4110,7 @@
 </file>
 
 <file path=word/header1.xml><?xml version="1.0" encoding="utf-8"?>
-<w:hdr xmlns:wpc="http://schemas.microsoft.com/office/word/2010/wordprocessingCanvas" xmlns:cx="http://schemas.microsoft.com/office/drawing/2014/chartex" xmlns:cx1="http://schemas.microsoft.com/office/drawing/2015/9/8/chartex" xmlns:cx2="http://schemas.microsoft.com/office/drawing/2015/10/21/chartex" xmlns:cx3="http://schemas.microsoft.com/office/drawing/2016/5/9/chartex" xmlns:cx4="http://schemas.microsoft.com/office/drawing/2016/5/10/chartex" xmlns:cx5="http://schemas.microsoft.com/office/drawing/2016/5/11/chartex" xmlns:cx6="http://schemas.microsoft.com/office/drawing/2016/5/12/chartex" xmlns:cx7="http://schemas.microsoft.com/office/drawing/2016/5/13/chartex" xmlns:cx8="http://schemas.microsoft.com/office/drawing/2016/5/14/chartex" xmlns:mc="http://schemas.openxmlformats.org/markup-compatibility/2006" xmlns:aink="http://schemas.microsoft.com/office/drawing/2016/ink" xmlns:am3d="http://schemas.microsoft.com/office/drawing/2017/model3d" xmlns:o="urn:schemas-microsoft-com:office:office" xmlns:oel="http://schemas.microsoft.com/office/2019/extlst" xmlns:r="http://schemas.openxmlformats.org/officeDocument/2006/relationships" xmlns:m="http://schemas.openxmlformats.org/officeDocument/2006/math" xmlns:v="urn:schemas-microsoft-com:vml" xmlns:wp14="http://schemas.microsoft.com/office/word/2010/wordprocessingDrawing" xmlns:wp="http://schemas.openxmlformats.org/drawingml/2006/wordprocessingDrawing" xmlns:w10="urn:schemas-microsoft-com:office:word" xmlns:w="http://schemas.openxmlformats.org/wordprocessingml/2006/main" xmlns:w14="http://schemas.microsoft.com/office/word/2010/wordml" xmlns:w15="http://schemas.microsoft.com/office/word/2012/wordml" xmlns:w16cex="http://schemas.microsoft.com/office/word/2018/wordml/cex" xmlns:w16cid="http://schemas.microsoft.com/office/word/2016/wordml/cid" xmlns:w16="http://schemas.microsoft.com/office/word/2018/wordml" xmlns:w16du="http://schemas.microsoft.com/office/word/2023/wordml/word16du" xmlns:w16sdtdh="http://schemas.microsoft.com/office/word/2020/wordml/sdtdatahash" xmlns:w16sdtfl="http://schemas.microsoft.com/office/word/2024/wordml/sdtformatlock" xmlns:w16se="http://schemas.microsoft.com/office/word/2015/wordml/symex" xmlns:wpg="http://schemas.microsoft.com/office/word/2010/wordprocessingGroup" xmlns:wpi="http://schemas.microsoft.com/office/word/2010/wordprocessingInk" xmlns:wne="http://schemas.microsoft.com/office/word/2006/wordml" xmlns:wps="http://schemas.microsoft.com/office/word/2010/wordprocessingShape" mc:Ignorable="w14 w15 w16se w16cid w16 w16cex w16sdtdh w16sdtfl w16du wp14">
+<w:hdr xmlns:wpc="http://schemas.microsoft.com/office/word/2010/wordprocessingCanvas" xmlns:cx="http://schemas.microsoft.com/office/drawing/2014/chartex" xmlns:cx1="http://schemas.microsoft.com/office/drawing/2015/9/8/chartex" xmlns:cx2="http://schemas.microsoft.com/office/drawing/2015/10/21/chartex" xmlns:cx3="http://schemas.microsoft.com/office/drawing/2016/5/9/chartex" xmlns:cx4="http://schemas.microsoft.com/office/drawing/2016/5/10/chartex" xmlns:cx5="http://schemas.microsoft.com/office/drawing/2016/5/11/chartex" xmlns:cx6="http://schemas.microsoft.com/office/drawing/2016/5/12/chartex" xmlns:cx7="http://schemas.microsoft.com/office/drawing/2016/5/13/chartex" xmlns:cx8="http://schemas.microsoft.com/office/drawing/2016/5/14/chartex" xmlns:mc="http://schemas.openxmlformats.org/markup-compatibility/2006" xmlns:aink="http://schemas.microsoft.com/office/drawing/2016/ink" xmlns:am3d="http://schemas.microsoft.com/office/drawing/2017/model3d" xmlns:o="urn:schemas-microsoft-com:office:office" xmlns:r="http://schemas.openxmlformats.org/officeDocument/2006/relationships" xmlns:m="http://schemas.openxmlformats.org/officeDocument/2006/math" xmlns:v="urn:schemas-microsoft-com:vml" xmlns:wp14="http://schemas.microsoft.com/office/word/2010/wordprocessingDrawing" xmlns:wp="http://schemas.openxmlformats.org/drawingml/2006/wordprocessingDrawing" xmlns:w10="urn:schemas-microsoft-com:office:word" xmlns:w="http://schemas.openxmlformats.org/wordprocessingml/2006/main" xmlns:w14="http://schemas.microsoft.com/office/word/2010/wordml" xmlns:w15="http://schemas.microsoft.com/office/word/2012/wordml" xmlns:w16cex="http://schemas.microsoft.com/office/word/2018/wordml/cex" xmlns:w16cid="http://schemas.microsoft.com/office/word/2016/wordml/cid" xmlns:w16="http://schemas.microsoft.com/office/word/2018/wordml" xmlns:w16sdtdh="http://schemas.microsoft.com/office/word/2020/wordml/sdtdatahash" xmlns:w16se="http://schemas.microsoft.com/office/word/2015/wordml/symex" xmlns:wpg="http://schemas.microsoft.com/office/word/2010/wordprocessingGroup" xmlns:wpi="http://schemas.microsoft.com/office/word/2010/wordprocessingInk" xmlns:wne="http://schemas.microsoft.com/office/word/2006/wordml" xmlns:wps="http://schemas.microsoft.com/office/word/2010/wordprocessingShape" mc:Ignorable="w14 w15 w16se w16cid w16 w16cex w16sdtdh wp14">
   <w:p>
     <w:pPr>
       <w:pStyle w:val="Header"/>
@@ -4547,7 +4355,7 @@
               <v:stroke joinstyle="miter"/>
               <v:path gradientshapeok="t" o:connecttype="rect"/>
             </v:shapetype>
-            <v:shape id="Text Box 7" o:spid="_x0000_s1026" type="#_x0000_t202" style="position:absolute;margin-left:-41.1pt;margin-top:48.05pt;width:583.25pt;height:20.8pt;z-index:251666432;visibility:visible;mso-wrap-style:square;mso-width-percent:0;mso-height-percent:0;mso-wrap-distance-left:9pt;mso-wrap-distance-top:0;mso-wrap-distance-right:9pt;mso-wrap-distance-bottom:0;mso-position-horizontal:absolute;mso-position-horizontal-relative:text;mso-position-vertical:absolute;mso-position-vertical-relative:text;mso-width-percent:0;mso-height-percent:0;mso-width-relative:margin;mso-height-relative:margin;v-text-anchor:top" o:gfxdata="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" filled="f" stroked="f" strokeweight=".5pt">
+            <v:shape id="Text Box 7" o:spid="_x0000_s1026" type="#_x0000_t202" style="position:absolute;margin-left:-41.1pt;margin-top:48.05pt;width:583.25pt;height:20.8pt;z-index:251666432;visibility:visible;mso-wrap-style:square;mso-width-percent:0;mso-height-percent:0;mso-wrap-distance-left:9pt;mso-wrap-distance-top:0;mso-wrap-distance-right:9pt;mso-wrap-distance-bottom:0;mso-position-horizontal:absolute;mso-position-horizontal-relative:text;mso-position-vertical:absolute;mso-position-vertical-relative:text;mso-width-percent:0;mso-height-percent:0;mso-width-relative:margin;mso-height-relative:margin;v-text-anchor:top" o:gfxdata="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" filled="f" stroked="f" strokeweight=".5pt">
               <v:textbox>
                 <w:txbxContent>
                   <w:p>
@@ -4805,7 +4613,7 @@
             </wp:anchor>
           </w:drawing>
         </mc:Choice>
-        <mc:Fallback>
+        <mc:Fallback xmlns:w16sdtfl="http://schemas.microsoft.com/office/word/2024/wordml/sdtformatlock" xmlns:w16du="http://schemas.microsoft.com/office/word/2023/wordml/word16du" xmlns:oel="http://schemas.microsoft.com/office/2019/extlst">
           <w:pict>
             <v:rect w14:anchorId="32BDC591" id="Rectangle 3" o:spid="_x0000_s1026" style="position:absolute;margin-left:-83.95pt;margin-top:38.45pt;width:646.35pt;height:12.15pt;z-index:-251652096;visibility:visible;mso-wrap-style:square;mso-width-percent:0;mso-height-percent:0;mso-wrap-distance-left:9pt;mso-wrap-distance-top:0;mso-wrap-distance-right:9pt;mso-wrap-distance-bottom:0;mso-position-horizontal:absolute;mso-position-horizontal-relative:text;mso-position-vertical:absolute;mso-position-vertical-relative:text;mso-width-percent:0;mso-height-percent:0;mso-width-relative:margin;mso-height-relative:margin;v-text-anchor:middle" o:gfxdata="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" fillcolor="#1c2856" stroked="f" strokeweight="1pt"/>
           </w:pict>
@@ -4889,7 +4697,7 @@
             </wp:anchor>
           </w:drawing>
         </mc:Choice>
-        <mc:Fallback>
+        <mc:Fallback xmlns:w16sdtfl="http://schemas.microsoft.com/office/word/2024/wordml/sdtformatlock" xmlns:w16du="http://schemas.microsoft.com/office/word/2023/wordml/word16du" xmlns:oel="http://schemas.microsoft.com/office/2019/extlst">
           <w:pict>
             <v:rect w14:anchorId="3FB23831" id="Rectangle 22" o:spid="_x0000_s1026" style="position:absolute;margin-left:-71.8pt;margin-top:47.35pt;width:634.25pt;height:23.45pt;z-index:-251645952;visibility:visible;mso-wrap-style:square;mso-width-percent:0;mso-height-percent:0;mso-wrap-distance-left:9pt;mso-wrap-distance-top:0;mso-wrap-distance-right:9pt;mso-wrap-distance-bottom:0;mso-position-horizontal:absolute;mso-position-horizontal-relative:text;mso-position-vertical:absolute;mso-position-vertical-relative:text;mso-width-percent:0;mso-height-percent:0;mso-width-relative:margin;mso-height-relative:margin;v-text-anchor:middle" o:gfxdata="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" fillcolor="#ebba44" stroked="f" strokeweight="1pt"/>
           </w:pict>
@@ -5035,7 +4843,7 @@
             </wp:anchor>
           </w:drawing>
         </mc:Choice>
-        <mc:Fallback>
+        <mc:Fallback xmlns:w16sdtfl="http://schemas.microsoft.com/office/word/2024/wordml/sdtformatlock" xmlns:w16du="http://schemas.microsoft.com/office/word/2023/wordml/word16du" xmlns:oel="http://schemas.microsoft.com/office/2019/extlst">
           <w:pict>
             <v:rect w14:anchorId="57394519" id="Rectangle 4" o:spid="_x0000_s1026" style="position:absolute;margin-left:-76pt;margin-top:-50.15pt;width:636.65pt;height:73.6pt;z-index:-251655168;visibility:visible;mso-wrap-style:square;mso-width-percent:0;mso-height-percent:0;mso-wrap-distance-left:9pt;mso-wrap-distance-top:0;mso-wrap-distance-right:9pt;mso-wrap-distance-bottom:0;mso-position-horizontal:absolute;mso-position-horizontal-relative:text;mso-position-vertical:absolute;mso-position-vertical-relative:text;mso-width-percent:0;mso-height-percent:0;mso-width-relative:margin;mso-height-relative:margin;v-text-anchor:middle" o:gfxdata="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" fillcolor="white [3212]" stroked="f" strokeweight="1pt"/>
           </w:pict>
@@ -5047,7 +4855,7 @@
 </file>
 
 <file path=word/numbering.xml><?xml version="1.0" encoding="utf-8"?>
-<w:numbering xmlns:wpc="http://schemas.microsoft.com/office/word/2010/wordprocessingCanvas" xmlns:cx="http://schemas.microsoft.com/office/drawing/2014/chartex" xmlns:cx1="http://schemas.microsoft.com/office/drawing/2015/9/8/chartex" xmlns:cx2="http://schemas.microsoft.com/office/drawing/2015/10/21/chartex" xmlns:cx3="http://schemas.microsoft.com/office/drawing/2016/5/9/chartex" xmlns:cx4="http://schemas.microsoft.com/office/drawing/2016/5/10/chartex" xmlns:cx5="http://schemas.microsoft.com/office/drawing/2016/5/11/chartex" xmlns:cx6="http://schemas.microsoft.com/office/drawing/2016/5/12/chartex" xmlns:cx7="http://schemas.microsoft.com/office/drawing/2016/5/13/chartex" xmlns:cx8="http://schemas.microsoft.com/office/drawing/2016/5/14/chartex" xmlns:mc="http://schemas.openxmlformats.org/markup-compatibility/2006" xmlns:aink="http://schemas.microsoft.com/office/drawing/2016/ink" xmlns:am3d="http://schemas.microsoft.com/office/drawing/2017/model3d" xmlns:o="urn:schemas-microsoft-com:office:office" xmlns:oel="http://schemas.microsoft.com/office/2019/extlst" xmlns:r="http://schemas.openxmlformats.org/officeDocument/2006/relationships" xmlns:m="http://schemas.openxmlformats.org/officeDocument/2006/math" xmlns:v="urn:schemas-microsoft-com:vml" xmlns:wp14="http://schemas.microsoft.com/office/word/2010/wordprocessingDrawing" xmlns:wp="http://schemas.openxmlformats.org/drawingml/2006/wordprocessingDrawing" xmlns:w10="urn:schemas-microsoft-com:office:word" xmlns:w="http://schemas.openxmlformats.org/wordprocessingml/2006/main" xmlns:w14="http://schemas.microsoft.com/office/word/2010/wordml" xmlns:w15="http://schemas.microsoft.com/office/word/2012/wordml" xmlns:w16cex="http://schemas.microsoft.com/office/word/2018/wordml/cex" xmlns:w16cid="http://schemas.microsoft.com/office/word/2016/wordml/cid" xmlns:w16="http://schemas.microsoft.com/office/word/2018/wordml" xmlns:w16du="http://schemas.microsoft.com/office/word/2023/wordml/word16du" xmlns:w16sdtdh="http://schemas.microsoft.com/office/word/2020/wordml/sdtdatahash" xmlns:w16sdtfl="http://schemas.microsoft.com/office/word/2024/wordml/sdtformatlock" xmlns:w16se="http://schemas.microsoft.com/office/word/2015/wordml/symex" xmlns:wpg="http://schemas.microsoft.com/office/word/2010/wordprocessingGroup" xmlns:wpi="http://schemas.microsoft.com/office/word/2010/wordprocessingInk" xmlns:wne="http://schemas.microsoft.com/office/word/2006/wordml" xmlns:wps="http://schemas.microsoft.com/office/word/2010/wordprocessingShape" mc:Ignorable="w14 w15 w16se w16cid w16 w16cex w16sdtdh w16sdtfl w16du wp14">
+<w:numbering xmlns:wpc="http://schemas.microsoft.com/office/word/2010/wordprocessingCanvas" xmlns:cx="http://schemas.microsoft.com/office/drawing/2014/chartex" xmlns:cx1="http://schemas.microsoft.com/office/drawing/2015/9/8/chartex" xmlns:cx2="http://schemas.microsoft.com/office/drawing/2015/10/21/chartex" xmlns:cx3="http://schemas.microsoft.com/office/drawing/2016/5/9/chartex" xmlns:cx4="http://schemas.microsoft.com/office/drawing/2016/5/10/chartex" xmlns:cx5="http://schemas.microsoft.com/office/drawing/2016/5/11/chartex" xmlns:cx6="http://schemas.microsoft.com/office/drawing/2016/5/12/chartex" xmlns:cx7="http://schemas.microsoft.com/office/drawing/2016/5/13/chartex" xmlns:cx8="http://schemas.microsoft.com/office/drawing/2016/5/14/chartex" xmlns:mc="http://schemas.openxmlformats.org/markup-compatibility/2006" xmlns:aink="http://schemas.microsoft.com/office/drawing/2016/ink" xmlns:am3d="http://schemas.microsoft.com/office/drawing/2017/model3d" xmlns:o="urn:schemas-microsoft-com:office:office" xmlns:r="http://schemas.openxmlformats.org/officeDocument/2006/relationships" xmlns:m="http://schemas.openxmlformats.org/officeDocument/2006/math" xmlns:v="urn:schemas-microsoft-com:vml" xmlns:wp14="http://schemas.microsoft.com/office/word/2010/wordprocessingDrawing" xmlns:wp="http://schemas.openxmlformats.org/drawingml/2006/wordprocessingDrawing" xmlns:w10="urn:schemas-microsoft-com:office:word" xmlns:w="http://schemas.openxmlformats.org/wordprocessingml/2006/main" xmlns:w14="http://schemas.microsoft.com/office/word/2010/wordml" xmlns:w15="http://schemas.microsoft.com/office/word/2012/wordml" xmlns:w16cex="http://schemas.microsoft.com/office/word/2018/wordml/cex" xmlns:w16cid="http://schemas.microsoft.com/office/word/2016/wordml/cid" xmlns:w16="http://schemas.microsoft.com/office/word/2018/wordml" xmlns:w16sdtdh="http://schemas.microsoft.com/office/word/2020/wordml/sdtdatahash" xmlns:w16se="http://schemas.microsoft.com/office/word/2015/wordml/symex" xmlns:wpg="http://schemas.microsoft.com/office/word/2010/wordprocessingGroup" xmlns:wpi="http://schemas.microsoft.com/office/word/2010/wordprocessingInk" xmlns:wne="http://schemas.microsoft.com/office/word/2006/wordml" xmlns:wps="http://schemas.microsoft.com/office/word/2010/wordprocessingShape" mc:Ignorable="w14 w15 w16se w16cid w16 w16cex w16sdtdh wp14">
   <w:abstractNum w:abstractNumId="0" w15:restartNumberingAfterBreak="0">
     <w:nsid w:val="027A3976"/>
     <w:multiLevelType w:val="hybridMultilevel"/>
@@ -9569,131 +9377,131 @@
       </w:rPr>
     </w:lvl>
   </w:abstractNum>
-  <w:num w:numId="1" w16cid:durableId="329870821">
+  <w:num w:numId="1">
     <w:abstractNumId w:val="17"/>
   </w:num>
-  <w:num w:numId="2" w16cid:durableId="1304776075">
+  <w:num w:numId="2">
     <w:abstractNumId w:val="32"/>
   </w:num>
-  <w:num w:numId="3" w16cid:durableId="1717847363">
+  <w:num w:numId="3">
     <w:abstractNumId w:val="38"/>
   </w:num>
-  <w:num w:numId="4" w16cid:durableId="1782186178">
+  <w:num w:numId="4">
     <w:abstractNumId w:val="16"/>
   </w:num>
-  <w:num w:numId="5" w16cid:durableId="375784633">
+  <w:num w:numId="5">
     <w:abstractNumId w:val="1"/>
   </w:num>
-  <w:num w:numId="6" w16cid:durableId="1677228292">
+  <w:num w:numId="6">
     <w:abstractNumId w:val="24"/>
   </w:num>
-  <w:num w:numId="7" w16cid:durableId="1696073436">
+  <w:num w:numId="7">
     <w:abstractNumId w:val="9"/>
   </w:num>
-  <w:num w:numId="8" w16cid:durableId="1203787397">
+  <w:num w:numId="8">
     <w:abstractNumId w:val="27"/>
   </w:num>
-  <w:num w:numId="9" w16cid:durableId="866793196">
+  <w:num w:numId="9">
     <w:abstractNumId w:val="0"/>
   </w:num>
-  <w:num w:numId="10" w16cid:durableId="807236461">
+  <w:num w:numId="10">
     <w:abstractNumId w:val="18"/>
   </w:num>
-  <w:num w:numId="11" w16cid:durableId="1435321036">
+  <w:num w:numId="11">
     <w:abstractNumId w:val="14"/>
   </w:num>
-  <w:num w:numId="12" w16cid:durableId="1463576737">
+  <w:num w:numId="12">
     <w:abstractNumId w:val="25"/>
   </w:num>
-  <w:num w:numId="13" w16cid:durableId="1119645624">
+  <w:num w:numId="13">
     <w:abstractNumId w:val="15"/>
   </w:num>
-  <w:num w:numId="14" w16cid:durableId="534735793">
+  <w:num w:numId="14">
     <w:abstractNumId w:val="6"/>
   </w:num>
-  <w:num w:numId="15" w16cid:durableId="1284193221">
+  <w:num w:numId="15">
     <w:abstractNumId w:val="23"/>
   </w:num>
-  <w:num w:numId="16" w16cid:durableId="1673725187">
+  <w:num w:numId="16">
     <w:abstractNumId w:val="2"/>
   </w:num>
-  <w:num w:numId="17" w16cid:durableId="1923678481">
+  <w:num w:numId="17">
     <w:abstractNumId w:val="37"/>
   </w:num>
-  <w:num w:numId="18" w16cid:durableId="1801800282">
+  <w:num w:numId="18">
     <w:abstractNumId w:val="33"/>
   </w:num>
-  <w:num w:numId="19" w16cid:durableId="1745107899">
+  <w:num w:numId="19">
     <w:abstractNumId w:val="10"/>
   </w:num>
-  <w:num w:numId="20" w16cid:durableId="461001898">
+  <w:num w:numId="20">
     <w:abstractNumId w:val="20"/>
   </w:num>
-  <w:num w:numId="21" w16cid:durableId="1806577992">
+  <w:num w:numId="21">
     <w:abstractNumId w:val="5"/>
   </w:num>
-  <w:num w:numId="22" w16cid:durableId="1779177551">
+  <w:num w:numId="22">
     <w:abstractNumId w:val="11"/>
   </w:num>
-  <w:num w:numId="23" w16cid:durableId="1171094971">
+  <w:num w:numId="23">
     <w:abstractNumId w:val="35"/>
   </w:num>
-  <w:num w:numId="24" w16cid:durableId="2060744400">
+  <w:num w:numId="24">
     <w:abstractNumId w:val="21"/>
   </w:num>
-  <w:num w:numId="25" w16cid:durableId="36928193">
+  <w:num w:numId="25">
     <w:abstractNumId w:val="39"/>
   </w:num>
-  <w:num w:numId="26" w16cid:durableId="1660233516">
+  <w:num w:numId="26">
     <w:abstractNumId w:val="3"/>
   </w:num>
-  <w:num w:numId="27" w16cid:durableId="1628001216">
+  <w:num w:numId="27">
     <w:abstractNumId w:val="4"/>
   </w:num>
-  <w:num w:numId="28" w16cid:durableId="1346132628">
+  <w:num w:numId="28">
     <w:abstractNumId w:val="34"/>
   </w:num>
-  <w:num w:numId="29" w16cid:durableId="198668062">
+  <w:num w:numId="29">
     <w:abstractNumId w:val="26"/>
   </w:num>
-  <w:num w:numId="30" w16cid:durableId="2061248601">
+  <w:num w:numId="30">
     <w:abstractNumId w:val="36"/>
   </w:num>
-  <w:num w:numId="31" w16cid:durableId="1980187559">
+  <w:num w:numId="31">
     <w:abstractNumId w:val="12"/>
   </w:num>
-  <w:num w:numId="32" w16cid:durableId="1936135220">
+  <w:num w:numId="32">
     <w:abstractNumId w:val="8"/>
   </w:num>
-  <w:num w:numId="33" w16cid:durableId="1654140085">
+  <w:num w:numId="33">
     <w:abstractNumId w:val="13"/>
   </w:num>
-  <w:num w:numId="34" w16cid:durableId="24213573">
+  <w:num w:numId="34">
     <w:abstractNumId w:val="19"/>
   </w:num>
-  <w:num w:numId="35" w16cid:durableId="942147956">
+  <w:num w:numId="35">
     <w:abstractNumId w:val="31"/>
   </w:num>
-  <w:num w:numId="36" w16cid:durableId="1821461360">
+  <w:num w:numId="36">
     <w:abstractNumId w:val="29"/>
   </w:num>
-  <w:num w:numId="37" w16cid:durableId="1170100291">
+  <w:num w:numId="37">
     <w:abstractNumId w:val="30"/>
   </w:num>
-  <w:num w:numId="38" w16cid:durableId="1136947515">
+  <w:num w:numId="38">
     <w:abstractNumId w:val="28"/>
   </w:num>
-  <w:num w:numId="39" w16cid:durableId="1504466267">
+  <w:num w:numId="39">
     <w:abstractNumId w:val="22"/>
   </w:num>
-  <w:num w:numId="40" w16cid:durableId="1075206414">
+  <w:num w:numId="40">
     <w:abstractNumId w:val="7"/>
   </w:num>
 </w:numbering>
 </file>
 
 <file path=word/styles.xml><?xml version="1.0" encoding="utf-8"?>
-<w:styles xmlns:mc="http://schemas.openxmlformats.org/markup-compatibility/2006" xmlns:r="http://schemas.openxmlformats.org/officeDocument/2006/relationships" xmlns:w="http://schemas.openxmlformats.org/wordprocessingml/2006/main" xmlns:w14="http://schemas.microsoft.com/office/word/2010/wordml" xmlns:w15="http://schemas.microsoft.com/office/word/2012/wordml" xmlns:w16cex="http://schemas.microsoft.com/office/word/2018/wordml/cex" xmlns:w16cid="http://schemas.microsoft.com/office/word/2016/wordml/cid" xmlns:w16="http://schemas.microsoft.com/office/word/2018/wordml" xmlns:w16du="http://schemas.microsoft.com/office/word/2023/wordml/word16du" xmlns:w16sdtdh="http://schemas.microsoft.com/office/word/2020/wordml/sdtdatahash" xmlns:w16sdtfl="http://schemas.microsoft.com/office/word/2024/wordml/sdtformatlock" xmlns:w16se="http://schemas.microsoft.com/office/word/2015/wordml/symex" mc:Ignorable="w14 w15 w16se w16cid w16 w16cex w16sdtdh w16sdtfl w16du">
+<w:styles xmlns:mc="http://schemas.openxmlformats.org/markup-compatibility/2006" xmlns:r="http://schemas.openxmlformats.org/officeDocument/2006/relationships" xmlns:w="http://schemas.openxmlformats.org/wordprocessingml/2006/main" xmlns:w14="http://schemas.microsoft.com/office/word/2010/wordml" xmlns:w15="http://schemas.microsoft.com/office/word/2012/wordml" xmlns:w16cex="http://schemas.microsoft.com/office/word/2018/wordml/cex" xmlns:w16cid="http://schemas.microsoft.com/office/word/2016/wordml/cid" xmlns:w16="http://schemas.microsoft.com/office/word/2018/wordml" xmlns:w16sdtdh="http://schemas.microsoft.com/office/word/2020/wordml/sdtdatahash" xmlns:w16se="http://schemas.microsoft.com/office/word/2015/wordml/symex" mc:Ignorable="w14 w15 w16se w16cid w16 w16cex w16sdtdh">
   <w:docDefaults>
     <w:rPrDefault>
       <w:rPr>

</xml_diff>